<commit_message>
modelo de caso de uso atualizado
</commit_message>
<xml_diff>
--- a/UC - Modelo de Caso de Uso.docx
+++ b/UC - Modelo de Caso de Uso.docx
@@ -124,13 +124,7 @@
               <w:jc w:val="right"/>
             </w:pPr>
             <w:r>
-              <w:t>18</w:t>
-            </w:r>
-            <w:r>
-              <w:t>/06</w:t>
-            </w:r>
-            <w:r>
-              <w:t>/2020</w:t>
+              <w:t>18/06/2020</w:t>
             </w:r>
           </w:p>
         </w:tc>
@@ -148,11 +142,23 @@
           <w:p>
             <w:pPr>
               <w:pStyle w:val="LO-normal"/>
+              <w:tabs>
+                <w:tab w:val="left" w:pos="3315"/>
+              </w:tabs>
               <w:spacing w:after="0" w:line="240" w:lineRule="auto"/>
               <w:ind w:left="34"/>
             </w:pPr>
             <w:r>
               <w:t>Criação do Documento</w:t>
+            </w:r>
+            <w:r>
+              <w:t xml:space="preserve"> e alteração da descrição geral</w:t>
+            </w:r>
+            <w:r>
+              <w:t xml:space="preserve"> (use case)</w:t>
+            </w:r>
+            <w:r>
+              <w:t>.</w:t>
             </w:r>
           </w:p>
         </w:tc>
@@ -267,10 +273,22 @@
         <w:jc w:val="both"/>
       </w:pPr>
       <w:r>
-        <w:t xml:space="preserve">Este caso de Uso tem como objetivo permitir ao usuário manter (CRUD) o </w:t>
-      </w:r>
-      <w:r>
-        <w:t>Valor do indicador, este valor é o resultado da análise de todas as informações que fazem parte de um indicador.</w:t>
+        <w:t xml:space="preserve">Este caso de Uso tem como objetivo permitir ao </w:t>
+      </w:r>
+      <w:r>
+        <w:t xml:space="preserve">Administrador </w:t>
+      </w:r>
+      <w:r>
+        <w:t xml:space="preserve">do Sistema </w:t>
+      </w:r>
+      <w:r>
+        <w:t xml:space="preserve">manter (CRUD) o </w:t>
+      </w:r>
+      <w:r>
+        <w:t>Cliente</w:t>
+      </w:r>
+      <w:r>
+        <w:t>.</w:t>
       </w:r>
     </w:p>
     <w:p>
@@ -280,22 +298,11 @@
         <w:jc w:val="both"/>
       </w:pPr>
       <w:r>
-        <w:rPr>
-          <w:noProof/>
-        </w:rPr>
         <w:drawing>
-          <wp:anchor distT="0" distB="0" distL="0" distR="0" simplePos="0" relativeHeight="5" behindDoc="0" locked="0" layoutInCell="1" allowOverlap="1" wp14:anchorId="2F19E4B8" wp14:editId="0F683333">
-            <wp:simplePos x="0" y="0"/>
-            <wp:positionH relativeFrom="column">
-              <wp:align>center</wp:align>
-            </wp:positionH>
-            <wp:positionV relativeFrom="paragraph">
-              <wp:posOffset>635</wp:posOffset>
-            </wp:positionV>
-            <wp:extent cx="6480810" cy="4133850"/>
-            <wp:effectExtent l="0" t="0" r="0" b="0"/>
-            <wp:wrapSquare wrapText="largest"/>
-            <wp:docPr id="1" name="Figura1"/>
+          <wp:inline distT="0" distB="0" distL="0" distR="0" wp14:anchorId="0DC69EA9" wp14:editId="5DA67FE2">
+            <wp:extent cx="6480810" cy="3611245"/>
+            <wp:effectExtent l="0" t="0" r="0" b="8255"/>
+            <wp:docPr id="1" name="Imagem 1"/>
             <wp:cNvGraphicFramePr>
               <a:graphicFrameLocks xmlns:a="http://schemas.openxmlformats.org/drawingml/2006/main" noChangeAspect="1"/>
             </wp:cNvGraphicFramePr>
@@ -303,10 +310,8 @@
               <a:graphicData uri="http://schemas.openxmlformats.org/drawingml/2006/picture">
                 <pic:pic xmlns:pic="http://schemas.openxmlformats.org/drawingml/2006/picture">
                   <pic:nvPicPr>
-                    <pic:cNvPr id="1" name="Figura1"/>
-                    <pic:cNvPicPr>
-                      <a:picLocks noChangeAspect="1" noChangeArrowheads="1"/>
-                    </pic:cNvPicPr>
+                    <pic:cNvPr id="1" name=""/>
+                    <pic:cNvPicPr/>
                   </pic:nvPicPr>
                   <pic:blipFill>
                     <a:blip r:embed="rId6"/>
@@ -314,10 +319,10 @@
                       <a:fillRect/>
                     </a:stretch>
                   </pic:blipFill>
-                  <pic:spPr bwMode="auto">
+                  <pic:spPr>
                     <a:xfrm>
                       <a:off x="0" y="0"/>
-                      <a:ext cx="6480810" cy="4133850"/>
+                      <a:ext cx="6480810" cy="3611245"/>
                     </a:xfrm>
                     <a:prstGeom prst="rect">
                       <a:avLst/>
@@ -326,7 +331,7 @@
                 </pic:pic>
               </a:graphicData>
             </a:graphic>
-          </wp:anchor>
+          </wp:inline>
         </w:drawing>
       </w:r>
     </w:p>
@@ -347,16 +352,10 @@
       <w:pPr>
         <w:pStyle w:val="LO-normal"/>
         <w:ind w:left="0"/>
-        <w:jc w:val="both"/>
-      </w:pPr>
-      <w:r>
-        <w:t>Servidor SES</w:t>
-      </w:r>
-    </w:p>
-    <w:p>
-      <w:pPr>
-        <w:pStyle w:val="LO-normal"/>
-      </w:pPr>
+      </w:pPr>
+      <w:r>
+        <w:t>Cliente</w:t>
+      </w:r>
     </w:p>
     <w:p>
       <w:pPr>
@@ -423,10 +422,7 @@
         <w:spacing w:after="0" w:line="240" w:lineRule="auto"/>
       </w:pPr>
       <w:r>
-        <w:t xml:space="preserve">Usuário </w:t>
-      </w:r>
-      <w:r>
-        <w:t>deseja incluir novo valor para uma competência de um indicador</w:t>
+        <w:t>Usuário deseja incluir novo valor para uma competência de um indicador</w:t>
       </w:r>
     </w:p>
     <w:p>
@@ -454,45 +450,45 @@
         <w:spacing w:after="0" w:line="240" w:lineRule="auto"/>
       </w:pPr>
       <w:r>
+        <w:t>Usuário confirma ação de inclusão</w:t>
+      </w:r>
+    </w:p>
+    <w:p>
+      <w:pPr>
+        <w:pStyle w:val="LO-normal"/>
+        <w:numPr>
+          <w:ilvl w:val="0"/>
+          <w:numId w:val="10"/>
+        </w:numPr>
+        <w:spacing w:after="0" w:line="240" w:lineRule="auto"/>
+      </w:pPr>
+      <w:r>
+        <w:t>Sistema retorna mensagem de sucesso</w:t>
+      </w:r>
+    </w:p>
+    <w:p>
+      <w:pPr>
+        <w:pStyle w:val="LO-normal"/>
+        <w:numPr>
+          <w:ilvl w:val="0"/>
+          <w:numId w:val="10"/>
+        </w:numPr>
+        <w:spacing w:after="0" w:line="240" w:lineRule="auto"/>
+      </w:pPr>
+      <w:r>
+        <w:t>fim</w:t>
+      </w:r>
+    </w:p>
+    <w:p>
+      <w:pPr>
+        <w:pStyle w:val="LO-normal"/>
+        <w:ind w:left="0"/>
+      </w:pPr>
+      <w:r>
+        <w:rPr>
+          <w:noProof/>
+        </w:rPr>
         <w:lastRenderedPageBreak/>
-        <w:t>Usuário confirma ação de inclusão</w:t>
-      </w:r>
-    </w:p>
-    <w:p>
-      <w:pPr>
-        <w:pStyle w:val="LO-normal"/>
-        <w:numPr>
-          <w:ilvl w:val="0"/>
-          <w:numId w:val="10"/>
-        </w:numPr>
-        <w:spacing w:after="0" w:line="240" w:lineRule="auto"/>
-      </w:pPr>
-      <w:r>
-        <w:t>Sistema retorna mensagem de sucesso</w:t>
-      </w:r>
-    </w:p>
-    <w:p>
-      <w:pPr>
-        <w:pStyle w:val="LO-normal"/>
-        <w:numPr>
-          <w:ilvl w:val="0"/>
-          <w:numId w:val="10"/>
-        </w:numPr>
-        <w:spacing w:after="0" w:line="240" w:lineRule="auto"/>
-      </w:pPr>
-      <w:r>
-        <w:t>fim</w:t>
-      </w:r>
-    </w:p>
-    <w:p>
-      <w:pPr>
-        <w:pStyle w:val="LO-normal"/>
-        <w:ind w:left="0"/>
-      </w:pPr>
-      <w:r>
-        <w:rPr>
-          <w:noProof/>
-        </w:rPr>
         <w:drawing>
           <wp:inline distT="0" distB="0" distL="0" distR="0" wp14:anchorId="2B80E287" wp14:editId="0A7F14F6">
             <wp:extent cx="6482715" cy="6883400"/>
@@ -565,10 +561,7 @@
         <w:ind w:left="0"/>
       </w:pPr>
       <w:r>
-        <w:t xml:space="preserve">B) Fluxo Incluir </w:t>
-      </w:r>
-      <w:r>
-        <w:t>- Passo A.3</w:t>
+        <w:t>B) Fluxo Incluir - Passo A.3</w:t>
       </w:r>
     </w:p>
     <w:p>
@@ -663,7 +656,6 @@
         <w:spacing w:after="0" w:line="240" w:lineRule="auto"/>
       </w:pPr>
       <w:r>
-        <w:lastRenderedPageBreak/>
         <w:t>Sistema exibe os dados</w:t>
       </w:r>
     </w:p>
@@ -690,6 +682,7 @@
         <w:rPr>
           <w:noProof/>
         </w:rPr>
+        <w:lastRenderedPageBreak/>
         <w:drawing>
           <wp:inline distT="0" distB="0" distL="0" distR="0" wp14:anchorId="4853D285" wp14:editId="52C01826">
             <wp:extent cx="6482715" cy="6477000"/>
@@ -782,13 +775,7 @@
         <w:rPr>
           <w:color w:val="000000"/>
         </w:rPr>
-        <w:t xml:space="preserve">Usuário seleciona uma competência do </w:t>
-      </w:r>
-      <w:r>
-        <w:rPr>
-          <w:color w:val="000000"/>
-        </w:rPr>
-        <w:t>indicador</w:t>
+        <w:t>Usuário seleciona uma competência do indicador</w:t>
       </w:r>
     </w:p>
     <w:p>
@@ -883,13 +870,7 @@
         <w:rPr>
           <w:color w:val="000000"/>
         </w:rPr>
-        <w:t xml:space="preserve">Sistema grava log de </w:t>
-      </w:r>
-      <w:r>
-        <w:rPr>
-          <w:color w:val="000000"/>
-        </w:rPr>
-        <w:t>alteração (RN5)</w:t>
+        <w:t>Sistema grava log de alteração (RN5)</w:t>
       </w:r>
       <w:r>
         <w:rPr>
@@ -1177,10 +1158,7 @@
       <w:bookmarkEnd w:id="2"/>
       <w:r>
         <w:lastRenderedPageBreak/>
-        <w:t>Flu</w:t>
-      </w:r>
-      <w:r>
-        <w:t>xos de Exceção</w:t>
+        <w:t>Fluxos de Exceção</w:t>
       </w:r>
     </w:p>
     <w:p>
@@ -1272,10 +1250,7 @@
         <w:spacing w:after="0" w:line="240" w:lineRule="auto"/>
       </w:pPr>
       <w:r>
-        <w:t>Sis</w:t>
-      </w:r>
-      <w:r>
-        <w:t>tema mostra mensagem “O grupo do usuário não possui indicadores para incluir.”</w:t>
+        <w:t>Sistema mostra mensagem “O grupo do usuário não possui indicadores para incluir.”</w:t>
       </w:r>
     </w:p>
     <w:p>
@@ -1360,10 +1335,7 @@
         <w:ind w:left="0"/>
       </w:pPr>
       <w:r>
-        <w:t xml:space="preserve">I) </w:t>
-      </w:r>
-      <w:r>
-        <w:t>Fluxo Alterar - Passo B.2</w:t>
+        <w:t>I) Fluxo Alterar - Passo B.2</w:t>
       </w:r>
     </w:p>
     <w:p>
@@ -1445,10 +1417,7 @@
         <w:shd w:val="clear" w:color="auto" w:fill="F2F2F2"/>
       </w:pPr>
       <w:r>
-        <w:t>Detalha</w:t>
-      </w:r>
-      <w:r>
-        <w:t>mento Técnico</w:t>
+        <w:t>Detalhamento Técnico</w:t>
       </w:r>
     </w:p>
     <w:p>
@@ -1527,13 +1496,7 @@
         <w:rPr>
           <w:color w:val="000000"/>
         </w:rPr>
-        <w:t>O sistema deve permitir a inclusão dos valores do</w:t>
-      </w:r>
-      <w:r>
-        <w:rPr>
-          <w:color w:val="000000"/>
-        </w:rPr>
-        <w:t>s indicadores pela tela do sistema ou por processamento automático, ver abaixo:</w:t>
+        <w:t>O sistema deve permitir a inclusão dos valores dos indicadores pela tela do sistema ou por processamento automático, ver abaixo:</w:t>
       </w:r>
     </w:p>
     <w:p>
@@ -1570,13 +1533,7 @@
         <w:rPr>
           <w:color w:val="000000"/>
         </w:rPr>
-        <w:t>Sistema inicia leitura das planilhas dos indicadores conforme RN4, para cada planilha executa</w:t>
-      </w:r>
-      <w:r>
-        <w:rPr>
-          <w:color w:val="000000"/>
-        </w:rPr>
-        <w:t xml:space="preserve"> os passos abaixo:</w:t>
+        <w:t>Sistema inicia leitura das planilhas dos indicadores conforme RN4, para cada planilha executa os passos abaixo:</w:t>
       </w:r>
     </w:p>
     <w:p>
@@ -1653,13 +1610,7 @@
         <w:rPr>
           <w:color w:val="000000"/>
         </w:rPr>
-        <w:t xml:space="preserve">Prosseguir para o </w:t>
-      </w:r>
-      <w:r>
-        <w:rPr>
-          <w:color w:val="000000"/>
-        </w:rPr>
-        <w:t>processamento de próxima planilha</w:t>
+        <w:t>Prosseguir para o processamento de próxima planilha</w:t>
       </w:r>
     </w:p>
     <w:p>
@@ -1716,13 +1667,7 @@
         <w:rPr>
           <w:color w:val="000000"/>
         </w:rPr>
-        <w:t>registra mensagem de log de erro na tabela de erro do sistema com o indicador que apresentou</w:t>
-      </w:r>
-      <w:r>
-        <w:rPr>
-          <w:color w:val="000000"/>
-        </w:rPr>
-        <w:t xml:space="preserve"> problema</w:t>
+        <w:t>registra mensagem de log de erro na tabela de erro do sistema com o indicador que apresentou problema</w:t>
       </w:r>
     </w:p>
     <w:p>

</xml_diff>